<commit_message>
Survey: use speciality names for doctors, remove scoring
Co-Authored-By: Claude Opus 5.5 <noreply@anthropic.com>
Claude-Session: https://claude.ai/code/session_015zKRQZW4y7iQW81L7F9FVv
</commit_message>
<xml_diff>
--- a/survey/PB_Health_Employee_Awareness_Survey.docx
+++ b/survey/PB_Health_Employee_Awareness_Survey.docx
@@ -1231,7 +1231,7 @@
           <w:sz w:val="18"/>
           <w:szCs w:val="18"/>
         </w:rPr>
-        <w:t xml:space="preserve">QUIZ  (★ = correct answer, 1 mark each)</w:t>
+        <w:t xml:space="preserve">KNOW YOUR HOSPITAL  (★ = correct answer)</w:t>
       </w:r>
     </w:p>
     <w:p>
@@ -1835,11 +1835,9 @@
         </w:tblBorders>
       </w:tblPr>
       <w:tblGrid>
-        <w:gridCol w:w="2097"/>
-        <w:gridCol w:w="2097"/>
-        <w:gridCol w:w="2097"/>
-        <w:gridCol w:w="2097"/>
-        <w:gridCol w:w="2098"/>
+        <w:gridCol w:w="3495"/>
+        <w:gridCol w:w="3495"/>
+        <w:gridCol w:w="3496"/>
       </w:tblGrid>
       <w:tr>
         <w:trPr>
@@ -1847,216 +1845,130 @@
         </w:trPr>
         <w:tc>
           <w:tcPr>
-            <w:tcW w:type="dxa" w:w="2097"/>
-            <w:tcBorders>
-              <w:top w:val="none" w:color="FFFFFF" w:sz="0"/>
-              <w:left w:val="none" w:color="FFFFFF" w:sz="0"/>
-              <w:bottom w:val="none" w:color="FFFFFF" w:sz="0"/>
-              <w:right w:val="none" w:color="FFFFFF" w:sz="0"/>
-            </w:tcBorders>
-            <w:tcMar>
-              <w:top w:type="dxa" w:w="25"/>
-              <w:left w:type="dxa" w:w="90"/>
-              <w:bottom w:type="dxa" w:w="25"/>
-              <w:right w:type="dxa" w:w="60"/>
-            </w:tcMar>
-          </w:tcPr>
-          <w:p>
-            <w:pPr>
-              <w:keepNext/>
-              <w:spacing w:after="0" w:before="0"/>
-            </w:pPr>
-            <w:r>
-              <w:rPr>
-                <w:rFonts w:ascii="Arial" w:cs="Arial" w:eastAsia="Arial" w:hAnsi="Arial"/>
-                <w:color w:val="000000"/>
-                <w:sz w:val="20"/>
-                <w:szCs w:val="20"/>
-              </w:rPr>
-              <w:t xml:space="preserve">☐ </w:t>
-            </w:r>
-            <w:r>
-              <w:rPr>
-                <w:rFonts w:ascii="Arial" w:cs="Arial" w:eastAsia="Arial" w:hAnsi="Arial"/>
-                <w:b w:val="false"/>
-                <w:bCs w:val="false"/>
-                <w:color w:val="000000"/>
-                <w:sz w:val="19"/>
-                <w:szCs w:val="19"/>
-              </w:rPr>
-              <w:t xml:space="preserve">Heart</w:t>
-            </w:r>
-          </w:p>
-        </w:tc>
-        <w:tc>
-          <w:tcPr>
-            <w:tcW w:type="dxa" w:w="2097"/>
-            <w:tcBorders>
-              <w:top w:val="none" w:color="FFFFFF" w:sz="0"/>
-              <w:left w:val="none" w:color="FFFFFF" w:sz="0"/>
-              <w:bottom w:val="none" w:color="FFFFFF" w:sz="0"/>
-              <w:right w:val="none" w:color="FFFFFF" w:sz="0"/>
-            </w:tcBorders>
-            <w:tcMar>
-              <w:top w:type="dxa" w:w="25"/>
-              <w:left w:type="dxa" w:w="90"/>
-              <w:bottom w:type="dxa" w:w="25"/>
-              <w:right w:type="dxa" w:w="60"/>
-            </w:tcMar>
-          </w:tcPr>
-          <w:p>
-            <w:pPr>
-              <w:keepNext/>
-              <w:spacing w:after="0" w:before="0"/>
-            </w:pPr>
-            <w:r>
-              <w:rPr>
-                <w:rFonts w:ascii="Arial" w:cs="Arial" w:eastAsia="Arial" w:hAnsi="Arial"/>
-                <w:color w:val="000000"/>
-                <w:sz w:val="20"/>
-                <w:szCs w:val="20"/>
-              </w:rPr>
-              <w:t xml:space="preserve">☐ </w:t>
-            </w:r>
-            <w:r>
-              <w:rPr>
-                <w:rFonts w:ascii="Arial" w:cs="Arial" w:eastAsia="Arial" w:hAnsi="Arial"/>
-                <w:b w:val="false"/>
-                <w:bCs w:val="false"/>
-                <w:color w:val="000000"/>
-                <w:sz w:val="19"/>
-                <w:szCs w:val="19"/>
-              </w:rPr>
-              <w:t xml:space="preserve">Bones &amp; joints</w:t>
-            </w:r>
-          </w:p>
-        </w:tc>
-        <w:tc>
-          <w:tcPr>
-            <w:tcW w:type="dxa" w:w="2097"/>
-            <w:tcBorders>
-              <w:top w:val="none" w:color="FFFFFF" w:sz="0"/>
-              <w:left w:val="none" w:color="FFFFFF" w:sz="0"/>
-              <w:bottom w:val="none" w:color="FFFFFF" w:sz="0"/>
-              <w:right w:val="none" w:color="FFFFFF" w:sz="0"/>
-            </w:tcBorders>
-            <w:tcMar>
-              <w:top w:type="dxa" w:w="25"/>
-              <w:left w:type="dxa" w:w="90"/>
-              <w:bottom w:type="dxa" w:w="25"/>
-              <w:right w:type="dxa" w:w="60"/>
-            </w:tcMar>
-          </w:tcPr>
-          <w:p>
-            <w:pPr>
-              <w:keepNext/>
-              <w:spacing w:after="0" w:before="0"/>
-            </w:pPr>
-            <w:r>
-              <w:rPr>
-                <w:rFonts w:ascii="Arial" w:cs="Arial" w:eastAsia="Arial" w:hAnsi="Arial"/>
-                <w:color w:val="000000"/>
-                <w:sz w:val="20"/>
-                <w:szCs w:val="20"/>
-              </w:rPr>
-              <w:t xml:space="preserve">☐ </w:t>
-            </w:r>
-            <w:r>
-              <w:rPr>
-                <w:rFonts w:ascii="Arial" w:cs="Arial" w:eastAsia="Arial" w:hAnsi="Arial"/>
-                <w:b w:val="false"/>
-                <w:bCs w:val="false"/>
-                <w:color w:val="000000"/>
-                <w:sz w:val="19"/>
-                <w:szCs w:val="19"/>
-              </w:rPr>
-              <w:t xml:space="preserve">Brain &amp; nerves</w:t>
-            </w:r>
-          </w:p>
-        </w:tc>
-        <w:tc>
-          <w:tcPr>
-            <w:tcW w:type="dxa" w:w="2097"/>
-            <w:tcBorders>
-              <w:top w:val="none" w:color="FFFFFF" w:sz="0"/>
-              <w:left w:val="none" w:color="FFFFFF" w:sz="0"/>
-              <w:bottom w:val="none" w:color="FFFFFF" w:sz="0"/>
-              <w:right w:val="none" w:color="FFFFFF" w:sz="0"/>
-            </w:tcBorders>
-            <w:tcMar>
-              <w:top w:type="dxa" w:w="25"/>
-              <w:left w:type="dxa" w:w="90"/>
-              <w:bottom w:type="dxa" w:w="25"/>
-              <w:right w:type="dxa" w:w="60"/>
-            </w:tcMar>
-          </w:tcPr>
-          <w:p>
-            <w:pPr>
-              <w:keepNext/>
-              <w:spacing w:after="0" w:before="0"/>
-            </w:pPr>
-            <w:r>
-              <w:rPr>
-                <w:rFonts w:ascii="Arial" w:cs="Arial" w:eastAsia="Arial" w:hAnsi="Arial"/>
-                <w:color w:val="000000"/>
-                <w:sz w:val="20"/>
-                <w:szCs w:val="20"/>
-              </w:rPr>
-              <w:t xml:space="preserve">☐ </w:t>
-            </w:r>
-            <w:r>
-              <w:rPr>
-                <w:rFonts w:ascii="Arial" w:cs="Arial" w:eastAsia="Arial" w:hAnsi="Arial"/>
-                <w:b w:val="false"/>
-                <w:bCs w:val="false"/>
-                <w:color w:val="000000"/>
-                <w:sz w:val="19"/>
-                <w:szCs w:val="19"/>
-              </w:rPr>
-              <w:t xml:space="preserve">Stomach</w:t>
-            </w:r>
-          </w:p>
-        </w:tc>
-        <w:tc>
-          <w:tcPr>
-            <w:tcW w:type="dxa" w:w="2098"/>
-            <w:tcBorders>
-              <w:top w:val="none" w:color="FFFFFF" w:sz="0"/>
-              <w:left w:val="none" w:color="FFFFFF" w:sz="0"/>
-              <w:bottom w:val="none" w:color="FFFFFF" w:sz="0"/>
-              <w:right w:val="none" w:color="FFFFFF" w:sz="0"/>
-            </w:tcBorders>
-            <w:tcMar>
-              <w:top w:type="dxa" w:w="25"/>
-              <w:left w:type="dxa" w:w="90"/>
-              <w:bottom w:type="dxa" w:w="25"/>
-              <w:right w:type="dxa" w:w="60"/>
-            </w:tcMar>
-          </w:tcPr>
-          <w:p>
-            <w:pPr>
-              <w:keepNext/>
-              <w:spacing w:after="0" w:before="0"/>
-            </w:pPr>
-            <w:r>
-              <w:rPr>
-                <w:rFonts w:ascii="Arial" w:cs="Arial" w:eastAsia="Arial" w:hAnsi="Arial"/>
-                <w:color w:val="000000"/>
-                <w:sz w:val="20"/>
-                <w:szCs w:val="20"/>
-              </w:rPr>
-              <w:t xml:space="preserve">☐ </w:t>
-            </w:r>
-            <w:r>
-              <w:rPr>
-                <w:rFonts w:ascii="Arial" w:cs="Arial" w:eastAsia="Arial" w:hAnsi="Arial"/>
-                <w:b w:val="false"/>
-                <w:bCs w:val="false"/>
-                <w:color w:val="000000"/>
-                <w:sz w:val="19"/>
-                <w:szCs w:val="19"/>
-              </w:rPr>
-              <w:t xml:space="preserve">Child</w:t>
+            <w:tcW w:type="dxa" w:w="3495"/>
+            <w:tcBorders>
+              <w:top w:val="none" w:color="FFFFFF" w:sz="0"/>
+              <w:left w:val="none" w:color="FFFFFF" w:sz="0"/>
+              <w:bottom w:val="none" w:color="FFFFFF" w:sz="0"/>
+              <w:right w:val="none" w:color="FFFFFF" w:sz="0"/>
+            </w:tcBorders>
+            <w:tcMar>
+              <w:top w:type="dxa" w:w="25"/>
+              <w:left w:type="dxa" w:w="90"/>
+              <w:bottom w:type="dxa" w:w="25"/>
+              <w:right w:type="dxa" w:w="60"/>
+            </w:tcMar>
+          </w:tcPr>
+          <w:p>
+            <w:pPr>
+              <w:keepNext/>
+              <w:spacing w:after="0" w:before="0"/>
+            </w:pPr>
+            <w:r>
+              <w:rPr>
+                <w:rFonts w:ascii="Arial" w:cs="Arial" w:eastAsia="Arial" w:hAnsi="Arial"/>
+                <w:color w:val="000000"/>
+                <w:sz w:val="20"/>
+                <w:szCs w:val="20"/>
+              </w:rPr>
+              <w:t xml:space="preserve">☐ </w:t>
+            </w:r>
+            <w:r>
+              <w:rPr>
+                <w:rFonts w:ascii="Arial" w:cs="Arial" w:eastAsia="Arial" w:hAnsi="Arial"/>
+                <w:b w:val="false"/>
+                <w:bCs w:val="false"/>
+                <w:color w:val="000000"/>
+                <w:sz w:val="19"/>
+                <w:szCs w:val="19"/>
+              </w:rPr>
+              <w:t xml:space="preserve">Cardiology</w:t>
+            </w:r>
+          </w:p>
+        </w:tc>
+        <w:tc>
+          <w:tcPr>
+            <w:tcW w:type="dxa" w:w="3495"/>
+            <w:tcBorders>
+              <w:top w:val="none" w:color="FFFFFF" w:sz="0"/>
+              <w:left w:val="none" w:color="FFFFFF" w:sz="0"/>
+              <w:bottom w:val="none" w:color="FFFFFF" w:sz="0"/>
+              <w:right w:val="none" w:color="FFFFFF" w:sz="0"/>
+            </w:tcBorders>
+            <w:tcMar>
+              <w:top w:type="dxa" w:w="25"/>
+              <w:left w:type="dxa" w:w="90"/>
+              <w:bottom w:type="dxa" w:w="25"/>
+              <w:right w:type="dxa" w:w="60"/>
+            </w:tcMar>
+          </w:tcPr>
+          <w:p>
+            <w:pPr>
+              <w:keepNext/>
+              <w:spacing w:after="0" w:before="0"/>
+            </w:pPr>
+            <w:r>
+              <w:rPr>
+                <w:rFonts w:ascii="Arial" w:cs="Arial" w:eastAsia="Arial" w:hAnsi="Arial"/>
+                <w:color w:val="000000"/>
+                <w:sz w:val="20"/>
+                <w:szCs w:val="20"/>
+              </w:rPr>
+              <w:t xml:space="preserve">☐ </w:t>
+            </w:r>
+            <w:r>
+              <w:rPr>
+                <w:rFonts w:ascii="Arial" w:cs="Arial" w:eastAsia="Arial" w:hAnsi="Arial"/>
+                <w:b w:val="false"/>
+                <w:bCs w:val="false"/>
+                <w:color w:val="000000"/>
+                <w:sz w:val="19"/>
+                <w:szCs w:val="19"/>
+              </w:rPr>
+              <w:t xml:space="preserve">Orthopaedics</w:t>
+            </w:r>
+          </w:p>
+        </w:tc>
+        <w:tc>
+          <w:tcPr>
+            <w:tcW w:type="dxa" w:w="3496"/>
+            <w:tcBorders>
+              <w:top w:val="none" w:color="FFFFFF" w:sz="0"/>
+              <w:left w:val="none" w:color="FFFFFF" w:sz="0"/>
+              <w:bottom w:val="none" w:color="FFFFFF" w:sz="0"/>
+              <w:right w:val="none" w:color="FFFFFF" w:sz="0"/>
+            </w:tcBorders>
+            <w:tcMar>
+              <w:top w:type="dxa" w:w="25"/>
+              <w:left w:type="dxa" w:w="90"/>
+              <w:bottom w:type="dxa" w:w="25"/>
+              <w:right w:type="dxa" w:w="60"/>
+            </w:tcMar>
+          </w:tcPr>
+          <w:p>
+            <w:pPr>
+              <w:keepNext/>
+              <w:spacing w:after="0" w:before="0"/>
+            </w:pPr>
+            <w:r>
+              <w:rPr>
+                <w:rFonts w:ascii="Arial" w:cs="Arial" w:eastAsia="Arial" w:hAnsi="Arial"/>
+                <w:color w:val="000000"/>
+                <w:sz w:val="20"/>
+                <w:szCs w:val="20"/>
+              </w:rPr>
+              <w:t xml:space="preserve">☐ </w:t>
+            </w:r>
+            <w:r>
+              <w:rPr>
+                <w:rFonts w:ascii="Arial" w:cs="Arial" w:eastAsia="Arial" w:hAnsi="Arial"/>
+                <w:b w:val="false"/>
+                <w:bCs w:val="false"/>
+                <w:color w:val="000000"/>
+                <w:sz w:val="19"/>
+                <w:szCs w:val="19"/>
+              </w:rPr>
+              <w:t xml:space="preserve">Neurology / Neurosurgery</w:t>
             </w:r>
           </w:p>
         </w:tc>
@@ -2067,50 +1979,141 @@
         </w:trPr>
         <w:tc>
           <w:tcPr>
-            <w:tcW w:type="dxa" w:w="2097"/>
-            <w:tcBorders>
-              <w:top w:val="none" w:color="FFFFFF" w:sz="0"/>
-              <w:left w:val="none" w:color="FFFFFF" w:sz="0"/>
-              <w:bottom w:val="none" w:color="FFFFFF" w:sz="0"/>
-              <w:right w:val="none" w:color="FFFFFF" w:sz="0"/>
-            </w:tcBorders>
-            <w:tcMar>
-              <w:top w:type="dxa" w:w="25"/>
-              <w:left w:type="dxa" w:w="90"/>
-              <w:bottom w:type="dxa" w:w="25"/>
-              <w:right w:type="dxa" w:w="60"/>
-            </w:tcMar>
-          </w:tcPr>
-          <w:p>
-            <w:pPr>
-              <w:keepNext/>
-              <w:spacing w:after="0" w:before="0"/>
-            </w:pPr>
-            <w:r>
-              <w:rPr>
-                <w:rFonts w:ascii="Arial" w:cs="Arial" w:eastAsia="Arial" w:hAnsi="Arial"/>
-                <w:color w:val="000000"/>
-                <w:sz w:val="20"/>
-                <w:szCs w:val="20"/>
-              </w:rPr>
-              <w:t xml:space="preserve">☐ </w:t>
-            </w:r>
-            <w:r>
-              <w:rPr>
-                <w:rFonts w:ascii="Arial" w:cs="Arial" w:eastAsia="Arial" w:hAnsi="Arial"/>
-                <w:b w:val="false"/>
-                <w:bCs w:val="false"/>
-                <w:color w:val="000000"/>
-                <w:sz w:val="19"/>
-                <w:szCs w:val="19"/>
-              </w:rPr>
-              <w:t xml:space="preserve">Women's health</w:t>
-            </w:r>
-          </w:p>
-        </w:tc>
-        <w:tc>
-          <w:tcPr>
-            <w:tcW w:type="dxa" w:w="2097"/>
+            <w:tcW w:type="dxa" w:w="3495"/>
+            <w:tcBorders>
+              <w:top w:val="none" w:color="FFFFFF" w:sz="0"/>
+              <w:left w:val="none" w:color="FFFFFF" w:sz="0"/>
+              <w:bottom w:val="none" w:color="FFFFFF" w:sz="0"/>
+              <w:right w:val="none" w:color="FFFFFF" w:sz="0"/>
+            </w:tcBorders>
+            <w:tcMar>
+              <w:top w:type="dxa" w:w="25"/>
+              <w:left w:type="dxa" w:w="90"/>
+              <w:bottom w:type="dxa" w:w="25"/>
+              <w:right w:type="dxa" w:w="60"/>
+            </w:tcMar>
+          </w:tcPr>
+          <w:p>
+            <w:pPr>
+              <w:keepNext/>
+              <w:spacing w:after="0" w:before="0"/>
+            </w:pPr>
+            <w:r>
+              <w:rPr>
+                <w:rFonts w:ascii="Arial" w:cs="Arial" w:eastAsia="Arial" w:hAnsi="Arial"/>
+                <w:color w:val="000000"/>
+                <w:sz w:val="20"/>
+                <w:szCs w:val="20"/>
+              </w:rPr>
+              <w:t xml:space="preserve">☐ </w:t>
+            </w:r>
+            <w:r>
+              <w:rPr>
+                <w:rFonts w:ascii="Arial" w:cs="Arial" w:eastAsia="Arial" w:hAnsi="Arial"/>
+                <w:b w:val="false"/>
+                <w:bCs w:val="false"/>
+                <w:color w:val="000000"/>
+                <w:sz w:val="19"/>
+                <w:szCs w:val="19"/>
+              </w:rPr>
+              <w:t xml:space="preserve">Gastroenterology</w:t>
+            </w:r>
+          </w:p>
+        </w:tc>
+        <w:tc>
+          <w:tcPr>
+            <w:tcW w:type="dxa" w:w="3495"/>
+            <w:tcBorders>
+              <w:top w:val="none" w:color="FFFFFF" w:sz="0"/>
+              <w:left w:val="none" w:color="FFFFFF" w:sz="0"/>
+              <w:bottom w:val="none" w:color="FFFFFF" w:sz="0"/>
+              <w:right w:val="none" w:color="FFFFFF" w:sz="0"/>
+            </w:tcBorders>
+            <w:tcMar>
+              <w:top w:type="dxa" w:w="25"/>
+              <w:left w:type="dxa" w:w="90"/>
+              <w:bottom w:type="dxa" w:w="25"/>
+              <w:right w:type="dxa" w:w="60"/>
+            </w:tcMar>
+          </w:tcPr>
+          <w:p>
+            <w:pPr>
+              <w:keepNext/>
+              <w:spacing w:after="0" w:before="0"/>
+            </w:pPr>
+            <w:r>
+              <w:rPr>
+                <w:rFonts w:ascii="Arial" w:cs="Arial" w:eastAsia="Arial" w:hAnsi="Arial"/>
+                <w:color w:val="000000"/>
+                <w:sz w:val="20"/>
+                <w:szCs w:val="20"/>
+              </w:rPr>
+              <w:t xml:space="preserve">☐ </w:t>
+            </w:r>
+            <w:r>
+              <w:rPr>
+                <w:rFonts w:ascii="Arial" w:cs="Arial" w:eastAsia="Arial" w:hAnsi="Arial"/>
+                <w:b w:val="false"/>
+                <w:bCs w:val="false"/>
+                <w:color w:val="000000"/>
+                <w:sz w:val="19"/>
+                <w:szCs w:val="19"/>
+              </w:rPr>
+              <w:t xml:space="preserve">Paediatrics</w:t>
+            </w:r>
+          </w:p>
+        </w:tc>
+        <w:tc>
+          <w:tcPr>
+            <w:tcW w:type="dxa" w:w="3496"/>
+            <w:tcBorders>
+              <w:top w:val="none" w:color="FFFFFF" w:sz="0"/>
+              <w:left w:val="none" w:color="FFFFFF" w:sz="0"/>
+              <w:bottom w:val="none" w:color="FFFFFF" w:sz="0"/>
+              <w:right w:val="none" w:color="FFFFFF" w:sz="0"/>
+            </w:tcBorders>
+            <w:tcMar>
+              <w:top w:type="dxa" w:w="25"/>
+              <w:left w:type="dxa" w:w="90"/>
+              <w:bottom w:type="dxa" w:w="25"/>
+              <w:right w:type="dxa" w:w="60"/>
+            </w:tcMar>
+          </w:tcPr>
+          <w:p>
+            <w:pPr>
+              <w:keepNext/>
+              <w:spacing w:after="0" w:before="0"/>
+            </w:pPr>
+            <w:r>
+              <w:rPr>
+                <w:rFonts w:ascii="Arial" w:cs="Arial" w:eastAsia="Arial" w:hAnsi="Arial"/>
+                <w:color w:val="000000"/>
+                <w:sz w:val="20"/>
+                <w:szCs w:val="20"/>
+              </w:rPr>
+              <w:t xml:space="preserve">☐ </w:t>
+            </w:r>
+            <w:r>
+              <w:rPr>
+                <w:rFonts w:ascii="Arial" w:cs="Arial" w:eastAsia="Arial" w:hAnsi="Arial"/>
+                <w:b w:val="false"/>
+                <w:bCs w:val="false"/>
+                <w:color w:val="000000"/>
+                <w:sz w:val="19"/>
+                <w:szCs w:val="19"/>
+              </w:rPr>
+              <w:t xml:space="preserve">Gynaecology</w:t>
+            </w:r>
+          </w:p>
+        </w:tc>
+      </w:tr>
+      <w:tr>
+        <w:trPr>
+          <w:cantSplit/>
+        </w:trPr>
+        <w:tc>
+          <w:tcPr>
+            <w:tcW w:type="dxa" w:w="3495"/>
             <w:tcBorders>
               <w:top w:val="none" w:color="FFFFFF" w:sz="0"/>
               <w:left w:val="none" w:color="FFFFFF" w:sz="0"/>
@@ -2153,50 +2156,50 @@
         </w:tc>
         <w:tc>
           <w:tcPr>
-            <w:tcW w:type="dxa" w:w="2097"/>
-            <w:tcBorders>
-              <w:top w:val="none" w:color="FFFFFF" w:sz="0"/>
-              <w:left w:val="none" w:color="FFFFFF" w:sz="0"/>
-              <w:bottom w:val="none" w:color="FFFFFF" w:sz="0"/>
-              <w:right w:val="none" w:color="FFFFFF" w:sz="0"/>
-            </w:tcBorders>
-            <w:tcMar>
-              <w:top w:type="dxa" w:w="25"/>
-              <w:left w:type="dxa" w:w="90"/>
-              <w:bottom w:type="dxa" w:w="25"/>
-              <w:right w:type="dxa" w:w="60"/>
-            </w:tcMar>
-          </w:tcPr>
-          <w:p>
-            <w:pPr>
-              <w:keepNext/>
-              <w:spacing w:after="0" w:before="0"/>
-            </w:pPr>
-            <w:r>
-              <w:rPr>
-                <w:rFonts w:ascii="Arial" w:cs="Arial" w:eastAsia="Arial" w:hAnsi="Arial"/>
-                <w:color w:val="000000"/>
-                <w:sz w:val="20"/>
-                <w:szCs w:val="20"/>
-              </w:rPr>
-              <w:t xml:space="preserve">☐ </w:t>
-            </w:r>
-            <w:r>
-              <w:rPr>
-                <w:rFonts w:ascii="Arial" w:cs="Arial" w:eastAsia="Arial" w:hAnsi="Arial"/>
-                <w:b w:val="false"/>
-                <w:bCs w:val="false"/>
-                <w:color w:val="000000"/>
-                <w:sz w:val="19"/>
-                <w:szCs w:val="19"/>
-              </w:rPr>
-              <w:t xml:space="preserve">Lungs</w:t>
-            </w:r>
-          </w:p>
-        </w:tc>
-        <w:tc>
-          <w:tcPr>
-            <w:tcW w:type="dxa" w:w="2097"/>
+            <w:tcW w:type="dxa" w:w="3495"/>
+            <w:tcBorders>
+              <w:top w:val="none" w:color="FFFFFF" w:sz="0"/>
+              <w:left w:val="none" w:color="FFFFFF" w:sz="0"/>
+              <w:bottom w:val="none" w:color="FFFFFF" w:sz="0"/>
+              <w:right w:val="none" w:color="FFFFFF" w:sz="0"/>
+            </w:tcBorders>
+            <w:tcMar>
+              <w:top w:type="dxa" w:w="25"/>
+              <w:left w:type="dxa" w:w="90"/>
+              <w:bottom w:type="dxa" w:w="25"/>
+              <w:right w:type="dxa" w:w="60"/>
+            </w:tcMar>
+          </w:tcPr>
+          <w:p>
+            <w:pPr>
+              <w:keepNext/>
+              <w:spacing w:after="0" w:before="0"/>
+            </w:pPr>
+            <w:r>
+              <w:rPr>
+                <w:rFonts w:ascii="Arial" w:cs="Arial" w:eastAsia="Arial" w:hAnsi="Arial"/>
+                <w:color w:val="000000"/>
+                <w:sz w:val="20"/>
+                <w:szCs w:val="20"/>
+              </w:rPr>
+              <w:t xml:space="preserve">☐ </w:t>
+            </w:r>
+            <w:r>
+              <w:rPr>
+                <w:rFonts w:ascii="Arial" w:cs="Arial" w:eastAsia="Arial" w:hAnsi="Arial"/>
+                <w:b w:val="false"/>
+                <w:bCs w:val="false"/>
+                <w:color w:val="000000"/>
+                <w:sz w:val="19"/>
+                <w:szCs w:val="19"/>
+              </w:rPr>
+              <w:t xml:space="preserve">Urology</w:t>
+            </w:r>
+          </w:p>
+        </w:tc>
+        <w:tc>
+          <w:tcPr>
+            <w:tcW w:type="dxa" w:w="3496"/>
             <w:tcBorders>
               <w:top w:val="none" w:color="FFFFFF" w:sz="0"/>
               <w:left w:val="none" w:color="FFFFFF" w:sz="0"/>
@@ -2246,28 +2249,6 @@
               </w:rPr>
               <w:t xml:space="preserve"> ★</w:t>
             </w:r>
-          </w:p>
-        </w:tc>
-        <w:tc>
-          <w:tcPr>
-            <w:tcW w:type="dxa" w:w="2098"/>
-            <w:tcBorders>
-              <w:top w:val="none" w:color="FFFFFF" w:sz="0"/>
-              <w:left w:val="none" w:color="FFFFFF" w:sz="0"/>
-              <w:bottom w:val="none" w:color="FFFFFF" w:sz="0"/>
-              <w:right w:val="none" w:color="FFFFFF" w:sz="0"/>
-            </w:tcBorders>
-            <w:tcMar>
-              <w:top w:type="dxa" w:w="25"/>
-              <w:left w:type="dxa" w:w="90"/>
-              <w:bottom w:type="dxa" w:w="25"/>
-              <w:right w:type="dxa" w:w="60"/>
-            </w:tcMar>
-          </w:tcPr>
-          <w:p>
-            <w:pPr>
-              <w:spacing w:after="0" w:before="0"/>
-            </w:pPr>
           </w:p>
         </w:tc>
       </w:tr>
@@ -3743,88 +3724,23 @@
         </w:tblBorders>
       </w:tblPr>
       <w:tblGrid>
-        <w:gridCol w:w="3600"/>
-        <w:gridCol w:w="6886"/>
+        <w:gridCol w:w="10486"/>
       </w:tblGrid>
       <w:tr>
         <w:tc>
           <w:tcPr>
-            <w:tcW w:type="dxa" w:w="3600"/>
+            <w:tcW w:type="dxa" w:w="10486"/>
             <w:tcBorders>
               <w:top w:val="single" w:color="D9D9D9" w:sz="4"/>
               <w:left w:val="single" w:color="D9D9D9" w:sz="4"/>
               <w:bottom w:val="single" w:color="D9D9D9" w:sz="4"/>
               <w:right w:val="single" w:color="D9D9D9" w:sz="4"/>
             </w:tcBorders>
-            <w:tcMar>
-              <w:top w:type="dxa" w:w="90"/>
-              <w:left w:type="dxa" w:w="140"/>
-              <w:bottom w:type="dxa" w:w="90"/>
-              <w:right w:type="dxa" w:w="100"/>
-            </w:tcMar>
-            <w:vAlign w:val="center"/>
-          </w:tcPr>
-          <w:p>
-            <w:pPr>
-              <w:spacing w:after="0" w:before="0"/>
-            </w:pPr>
-            <w:r>
-              <w:rPr>
-                <w:rFonts w:ascii="Arial" w:cs="Arial" w:eastAsia="Arial" w:hAnsi="Arial"/>
-                <w:b/>
-                <w:bCs/>
-                <w:color w:val="666666"/>
-                <w:sz w:val="18"/>
-                <w:szCs w:val="18"/>
-              </w:rPr>
-              <w:t xml:space="preserve">SCORE</w:t>
-            </w:r>
-          </w:p>
-          <w:p>
-            <w:pPr>
-              <w:spacing w:after="0" w:before="20"/>
-            </w:pPr>
-            <w:r>
-              <w:rPr>
-                <w:rFonts w:ascii="Arial" w:cs="Arial" w:eastAsia="Arial" w:hAnsi="Arial"/>
-                <w:color w:val="666666"/>
-                <w:sz w:val="17"/>
-                <w:szCs w:val="17"/>
-              </w:rPr>
-              <w:t xml:space="preserve">Count the ★ answers ticked (Q4 to Q12)</w:t>
-            </w:r>
-          </w:p>
-          <w:p>
-            <w:pPr>
-              <w:spacing w:after="0" w:before="60"/>
-            </w:pPr>
-            <w:r>
-              <w:rPr>
-                <w:rFonts w:ascii="Arial" w:cs="Arial" w:eastAsia="Arial" w:hAnsi="Arial"/>
-                <w:b/>
-                <w:bCs/>
-                <w:color w:val="000000"/>
-                <w:sz w:val="26"/>
-                <w:szCs w:val="26"/>
-              </w:rPr>
-              <w:t xml:space="preserve">Total:  _______ / 9</w:t>
-            </w:r>
-          </w:p>
-        </w:tc>
-        <w:tc>
-          <w:tcPr>
-            <w:tcW w:type="dxa" w:w="6886"/>
-            <w:tcBorders>
-              <w:top w:val="single" w:color="D9D9D9" w:sz="4"/>
-              <w:left w:val="single" w:color="D9D9D9" w:sz="4"/>
-              <w:bottom w:val="single" w:color="D9D9D9" w:sz="4"/>
-              <w:right w:val="single" w:color="D9D9D9" w:sz="4"/>
-            </w:tcBorders>
             <w:shd w:fill="1060A8" w:color="auto" w:val="clear"/>
             <w:tcMar>
-              <w:top w:type="dxa" w:w="90"/>
+              <w:top w:type="dxa" w:w="110"/>
               <w:left w:type="dxa" w:w="100"/>
-              <w:bottom w:type="dxa" w:w="90"/>
+              <w:bottom w:type="dxa" w:w="110"/>
               <w:right w:type="dxa" w:w="100"/>
             </w:tcMar>
             <w:vAlign w:val="center"/>
@@ -3866,8 +3782,8 @@
                 <w:b/>
                 <w:bCs/>
                 <w:color w:val="FFFFFF"/>
-                <w:sz w:val="32"/>
-                <w:szCs w:val="32"/>
+                <w:sz w:val="34"/>
+                <w:szCs w:val="34"/>
               </w:rPr>
               <w:t xml:space="preserve">1800 1201</w:t>
             </w:r>
@@ -3878,7 +3794,7 @@
                 <w:sz w:val="22"/>
                 <w:szCs w:val="22"/>
               </w:rPr>
-              <w:t xml:space="preserve">        Ambulance  </w:t>
+              <w:t xml:space="preserve">          Ambulance  </w:t>
             </w:r>
             <w:r>
               <w:rPr>
@@ -3886,8 +3802,8 @@
                 <w:b/>
                 <w:bCs/>
                 <w:color w:val="FFFFFF"/>
-                <w:sz w:val="32"/>
-                <w:szCs w:val="32"/>
+                <w:sz w:val="34"/>
+                <w:szCs w:val="34"/>
               </w:rPr>
               <w:t xml:space="preserve">1800 1203</w:t>
             </w:r>

</xml_diff>

<commit_message>
Add Google Form builder script; Q1 Yes/No and Q13 'No, why?'
survey/create_google_form.gs is an Apps Script that creates the survey as a
Google Form with the PB Health logo, a linked response sheet and skip logic:
- Q1 No skips 'How did you hear about it?'
- Q13 No opens a comment page asking why
- last page lists the benefits plus helpline and ambulance numbers

The printed form gets the same two changes.

Co-Authored-By: Claude Opus 5.5 <noreply@anthropic.com>
Claude-Session: https://claude.ai/code/session_015zKRQZW4y7iQW81L7F9FVv
</commit_message>
<xml_diff>
--- a/survey/PB_Health_Employee_Awareness_Survey.docx
+++ b/survey/PB_Health_Employee_Awareness_Survey.docx
@@ -485,9 +485,8 @@
         </w:tblBorders>
       </w:tblPr>
       <w:tblGrid>
-        <w:gridCol w:w="3495"/>
-        <w:gridCol w:w="3495"/>
-        <w:gridCol w:w="3496"/>
+        <w:gridCol w:w="1700"/>
+        <w:gridCol w:w="8786"/>
       </w:tblGrid>
       <w:tr>
         <w:trPr>
@@ -495,7 +494,7 @@
         </w:trPr>
         <w:tc>
           <w:tcPr>
-            <w:tcW w:type="dxa" w:w="3495"/>
+            <w:tcW w:type="dxa" w:w="1700"/>
             <w:tcBorders>
               <w:top w:val="none" w:color="FFFFFF" w:sz="0"/>
               <w:left w:val="none" w:color="FFFFFF" w:sz="0"/>
@@ -538,50 +537,7 @@
         </w:tc>
         <w:tc>
           <w:tcPr>
-            <w:tcW w:type="dxa" w:w="3495"/>
-            <w:tcBorders>
-              <w:top w:val="none" w:color="FFFFFF" w:sz="0"/>
-              <w:left w:val="none" w:color="FFFFFF" w:sz="0"/>
-              <w:bottom w:val="none" w:color="FFFFFF" w:sz="0"/>
-              <w:right w:val="none" w:color="FFFFFF" w:sz="0"/>
-            </w:tcBorders>
-            <w:tcMar>
-              <w:top w:type="dxa" w:w="25"/>
-              <w:left w:type="dxa" w:w="90"/>
-              <w:bottom w:type="dxa" w:w="25"/>
-              <w:right w:type="dxa" w:w="60"/>
-            </w:tcMar>
-          </w:tcPr>
-          <w:p>
-            <w:pPr>
-              <w:keepNext/>
-              <w:spacing w:after="0" w:before="0"/>
-            </w:pPr>
-            <w:r>
-              <w:rPr>
-                <w:rFonts w:ascii="Arial" w:cs="Arial" w:eastAsia="Arial" w:hAnsi="Arial"/>
-                <w:color w:val="000000"/>
-                <w:sz w:val="20"/>
-                <w:szCs w:val="20"/>
-              </w:rPr>
-              <w:t xml:space="preserve">☐ </w:t>
-            </w:r>
-            <w:r>
-              <w:rPr>
-                <w:rFonts w:ascii="Arial" w:cs="Arial" w:eastAsia="Arial" w:hAnsi="Arial"/>
-                <w:b w:val="false"/>
-                <w:bCs w:val="false"/>
-                <w:color w:val="000000"/>
-                <w:sz w:val="19"/>
-                <w:szCs w:val="19"/>
-              </w:rPr>
-              <w:t xml:space="preserve">Heard of it</w:t>
-            </w:r>
-          </w:p>
-        </w:tc>
-        <w:tc>
-          <w:tcPr>
-            <w:tcW w:type="dxa" w:w="3496"/>
+            <w:tcW w:type="dxa" w:w="8786"/>
             <w:tcBorders>
               <w:top w:val="none" w:color="FFFFFF" w:sz="0"/>
               <w:left w:val="none" w:color="FFFFFF" w:sz="0"/>
@@ -3547,9 +3503,9 @@
         </w:tblBorders>
       </w:tblPr>
       <w:tblGrid>
-        <w:gridCol w:w="3495"/>
-        <w:gridCol w:w="3495"/>
-        <w:gridCol w:w="3496"/>
+        <w:gridCol w:w="1700"/>
+        <w:gridCol w:w="1700"/>
+        <w:gridCol w:w="7086"/>
       </w:tblGrid>
       <w:tr>
         <w:trPr>
@@ -3557,7 +3513,7 @@
         </w:trPr>
         <w:tc>
           <w:tcPr>
-            <w:tcW w:type="dxa" w:w="3495"/>
+            <w:tcW w:type="dxa" w:w="1700"/>
             <w:tcBorders>
               <w:top w:val="none" w:color="FFFFFF" w:sz="0"/>
               <w:left w:val="none" w:color="FFFFFF" w:sz="0"/>
@@ -3600,7 +3556,7 @@
         </w:tc>
         <w:tc>
           <w:tcPr>
-            <w:tcW w:type="dxa" w:w="3495"/>
+            <w:tcW w:type="dxa" w:w="1700"/>
             <w:tcBorders>
               <w:top w:val="none" w:color="FFFFFF" w:sz="0"/>
               <w:left w:val="none" w:color="FFFFFF" w:sz="0"/>
@@ -3643,44 +3599,44 @@
         </w:tc>
         <w:tc>
           <w:tcPr>
-            <w:tcW w:type="dxa" w:w="3496"/>
-            <w:tcBorders>
-              <w:top w:val="none" w:color="FFFFFF" w:sz="0"/>
-              <w:left w:val="none" w:color="FFFFFF" w:sz="0"/>
-              <w:bottom w:val="none" w:color="FFFFFF" w:sz="0"/>
-              <w:right w:val="none" w:color="FFFFFF" w:sz="0"/>
-            </w:tcBorders>
-            <w:tcMar>
-              <w:top w:type="dxa" w:w="25"/>
-              <w:left w:type="dxa" w:w="90"/>
-              <w:bottom w:type="dxa" w:w="25"/>
-              <w:right w:type="dxa" w:w="60"/>
-            </w:tcMar>
-          </w:tcPr>
-          <w:p>
-            <w:pPr>
-              <w:keepNext/>
-              <w:spacing w:after="0" w:before="0"/>
-            </w:pPr>
-            <w:r>
-              <w:rPr>
-                <w:rFonts w:ascii="Arial" w:cs="Arial" w:eastAsia="Arial" w:hAnsi="Arial"/>
-                <w:color w:val="000000"/>
-                <w:sz w:val="20"/>
-                <w:szCs w:val="20"/>
-              </w:rPr>
-              <w:t xml:space="preserve">☐ </w:t>
-            </w:r>
-            <w:r>
-              <w:rPr>
-                <w:rFonts w:ascii="Arial" w:cs="Arial" w:eastAsia="Arial" w:hAnsi="Arial"/>
-                <w:b w:val="false"/>
-                <w:bCs w:val="false"/>
-                <w:color w:val="000000"/>
-                <w:sz w:val="19"/>
-                <w:szCs w:val="19"/>
-              </w:rPr>
-              <w:t xml:space="preserve">No</w:t>
+            <w:tcW w:type="dxa" w:w="7086"/>
+            <w:tcBorders>
+              <w:top w:val="none" w:color="FFFFFF" w:sz="0"/>
+              <w:left w:val="none" w:color="FFFFFF" w:sz="0"/>
+              <w:bottom w:val="none" w:color="FFFFFF" w:sz="0"/>
+              <w:right w:val="none" w:color="FFFFFF" w:sz="0"/>
+            </w:tcBorders>
+            <w:tcMar>
+              <w:top w:type="dxa" w:w="25"/>
+              <w:left w:type="dxa" w:w="90"/>
+              <w:bottom w:type="dxa" w:w="25"/>
+              <w:right w:type="dxa" w:w="60"/>
+            </w:tcMar>
+          </w:tcPr>
+          <w:p>
+            <w:pPr>
+              <w:keepNext/>
+              <w:spacing w:after="0" w:before="0"/>
+            </w:pPr>
+            <w:r>
+              <w:rPr>
+                <w:rFonts w:ascii="Arial" w:cs="Arial" w:eastAsia="Arial" w:hAnsi="Arial"/>
+                <w:color w:val="000000"/>
+                <w:sz w:val="20"/>
+                <w:szCs w:val="20"/>
+              </w:rPr>
+              <w:t xml:space="preserve">☐ </w:t>
+            </w:r>
+            <w:r>
+              <w:rPr>
+                <w:rFonts w:ascii="Arial" w:cs="Arial" w:eastAsia="Arial" w:hAnsi="Arial"/>
+                <w:b w:val="false"/>
+                <w:bCs w:val="false"/>
+                <w:color w:val="000000"/>
+                <w:sz w:val="19"/>
+                <w:szCs w:val="19"/>
+              </w:rPr>
+              <w:t xml:space="preserve">No, why? ______________________________________________</w:t>
             </w:r>
           </w:p>
         </w:tc>

</xml_diff>